<commit_message>
workable version for rendering yaml into docx template, for the checklist items
TODO: add rendering markdown for instructions and comments
</commit_message>
<xml_diff>
--- a/res/new_template_high.docx
+++ b/res/new_template_high.docx
@@ -121,13 +121,13 @@
         <w:tblLook w:val="04A0" w:firstRow="1" w:lastRow="0" w:firstColumn="1" w:lastColumn="0" w:noHBand="0" w:noVBand="1"/>
       </w:tblPr>
       <w:tblGrid>
-        <w:gridCol w:w="1431"/>
-        <w:gridCol w:w="1740"/>
-        <w:gridCol w:w="2696"/>
-        <w:gridCol w:w="4193"/>
-        <w:gridCol w:w="9736"/>
+        <w:gridCol w:w="1213"/>
+        <w:gridCol w:w="1636"/>
+        <w:gridCol w:w="2649"/>
+        <w:gridCol w:w="4007"/>
+        <w:gridCol w:w="9046"/>
         <w:gridCol w:w="1705"/>
-        <w:gridCol w:w="850"/>
+        <w:gridCol w:w="2095"/>
       </w:tblGrid>
       <w:tr>
         <w:trPr>
@@ -409,7 +409,6 @@
           <w:p>
             <w:pPr>
               <w:rPr>
-                <w:rFonts w:hint="eastAsia"/>
                 <w:b/>
                 <w:bCs/>
               </w:rPr>
@@ -594,43 +593,124 @@
             </w:tcMar>
           </w:tcPr>
           <w:p>
-            <w:pPr>
-              <w:rPr>
-                <w:b/>
-                <w:bCs/>
-              </w:rPr>
-            </w:pPr>
-            <w:proofErr w:type="gramStart"/>
             <w:r>
-              <w:rPr>
-                <w:b/>
-                <w:bCs/>
-              </w:rPr>
               <w:t xml:space="preserve">{{ </w:t>
             </w:r>
             <w:r>
               <w:rPr>
                 <w:rFonts w:hint="eastAsia"/>
-                <w:b/>
-                <w:bCs/>
               </w:rPr>
               <w:t>item.</w:t>
             </w:r>
             <w:r>
               <w:rPr>
                 <w:rFonts w:hint="eastAsia"/>
-                <w:b/>
-                <w:bCs/>
               </w:rPr>
               <w:t>id</w:t>
             </w:r>
-            <w:proofErr w:type="gramEnd"/>
             <w:r>
-              <w:rPr>
-                <w:b/>
-                <w:bCs/>
-              </w:rPr>
               <w:t xml:space="preserve"> }}</w:t>
+            </w:r>
+          </w:p>
+        </w:tc>
+        <w:tc>
+          <w:tcPr>
+            <w:tcW w:w="0" w:type="auto"/>
+            <w:tcBorders>
+              <w:top w:val="single" w:sz="8" w:space="0" w:color="000000"/>
+              <w:left w:val="single" w:sz="8" w:space="0" w:color="000000"/>
+              <w:bottom w:val="single" w:sz="8" w:space="0" w:color="000000"/>
+              <w:right w:val="single" w:sz="8" w:space="0" w:color="000000"/>
+            </w:tcBorders>
+            <w:shd w:val="clear" w:color="auto" w:fill="auto"/>
+            <w:tcMar>
+              <w:top w:w="100" w:type="dxa"/>
+              <w:left w:w="100" w:type="dxa"/>
+              <w:bottom w:w="100" w:type="dxa"/>
+              <w:right w:w="100" w:type="dxa"/>
+            </w:tcMar>
+          </w:tcPr>
+          <w:p>
+            <w:r>
+              <w:t>{{ item.action }}</w:t>
+            </w:r>
+          </w:p>
+        </w:tc>
+        <w:tc>
+          <w:tcPr>
+            <w:tcW w:w="2696" w:type="dxa"/>
+            <w:tcBorders>
+              <w:top w:val="single" w:sz="8" w:space="0" w:color="000000"/>
+              <w:left w:val="single" w:sz="8" w:space="0" w:color="000000"/>
+              <w:bottom w:val="single" w:sz="8" w:space="0" w:color="000000"/>
+              <w:right w:val="single" w:sz="8" w:space="0" w:color="000000"/>
+            </w:tcBorders>
+            <w:shd w:val="clear" w:color="auto" w:fill="auto"/>
+            <w:tcMar>
+              <w:top w:w="100" w:type="dxa"/>
+              <w:left w:w="100" w:type="dxa"/>
+              <w:bottom w:w="100" w:type="dxa"/>
+              <w:right w:w="100" w:type="dxa"/>
+            </w:tcMar>
+          </w:tcPr>
+          <w:p>
+            <w:r>
+              <w:t>{{ item.instructions }}</w:t>
+            </w:r>
+          </w:p>
+        </w:tc>
+        <w:tc>
+          <w:tcPr>
+            <w:tcW w:w="4193" w:type="dxa"/>
+            <w:tcBorders>
+              <w:top w:val="single" w:sz="8" w:space="0" w:color="000000"/>
+              <w:left w:val="single" w:sz="8" w:space="0" w:color="000000"/>
+              <w:bottom w:val="single" w:sz="8" w:space="0" w:color="000000"/>
+              <w:right w:val="single" w:sz="8" w:space="0" w:color="000000"/>
+            </w:tcBorders>
+            <w:shd w:val="clear" w:color="auto" w:fill="auto"/>
+            <w:tcMar>
+              <w:top w:w="100" w:type="dxa"/>
+              <w:left w:w="100" w:type="dxa"/>
+              <w:bottom w:w="100" w:type="dxa"/>
+              <w:right w:w="100" w:type="dxa"/>
+            </w:tcMar>
+          </w:tcPr>
+          <w:p>
+            <w:r>
+              <w:t>{{ item.instructions}}</w:t>
+            </w:r>
+          </w:p>
+        </w:tc>
+        <w:tc>
+          <w:tcPr>
+            <w:tcW w:w="9736" w:type="dxa"/>
+            <w:tcBorders>
+              <w:top w:val="single" w:sz="8" w:space="0" w:color="000000"/>
+              <w:left w:val="single" w:sz="8" w:space="0" w:color="000000"/>
+              <w:bottom w:val="single" w:sz="8" w:space="0" w:color="000000"/>
+              <w:right w:val="single" w:sz="8" w:space="0" w:color="000000"/>
+            </w:tcBorders>
+            <w:shd w:val="clear" w:color="auto" w:fill="auto"/>
+            <w:tcMar>
+              <w:top w:w="100" w:type="dxa"/>
+              <w:left w:w="100" w:type="dxa"/>
+              <w:bottom w:w="100" w:type="dxa"/>
+              <w:right w:w="100" w:type="dxa"/>
+            </w:tcMar>
+          </w:tcPr>
+          <w:p>
+            <w:r>
+              <w:t>{{ item.</w:t>
+            </w:r>
+            <w:r>
+              <w:t>comments</w:t>
+            </w:r>
+            <w:r>
+              <w:t xml:space="preserve"> </w:t>
+            </w:r>
+            <w:r>
+              <w:t>}}</w:t>
             </w:r>
           </w:p>
         </w:tc>
@@ -654,126 +734,9 @@
           <w:p>
             <w:pPr>
               <w:rPr>
-                <w:b/>
-                <w:bCs/>
-              </w:rPr>
-            </w:pPr>
-            <w:proofErr w:type="gramStart"/>
-            <w:r>
-              <w:rPr>
-                <w:b/>
-                <w:bCs/>
-              </w:rPr>
-              <w:t>{{ item</w:t>
-            </w:r>
-            <w:proofErr w:type="gramEnd"/>
-            <w:r>
-              <w:rPr>
-                <w:b/>
-                <w:bCs/>
-              </w:rPr>
-              <w:t>.action }}</w:t>
-            </w:r>
-          </w:p>
-        </w:tc>
-        <w:tc>
-          <w:tcPr>
-            <w:tcW w:w="2696" w:type="dxa"/>
-            <w:tcBorders>
-              <w:top w:val="single" w:sz="8" w:space="0" w:color="000000"/>
-              <w:left w:val="single" w:sz="8" w:space="0" w:color="000000"/>
-              <w:bottom w:val="single" w:sz="8" w:space="0" w:color="000000"/>
-              <w:right w:val="single" w:sz="8" w:space="0" w:color="000000"/>
-            </w:tcBorders>
-            <w:shd w:val="clear" w:color="auto" w:fill="auto"/>
-            <w:tcMar>
-              <w:top w:w="100" w:type="dxa"/>
-              <w:left w:w="100" w:type="dxa"/>
-              <w:bottom w:w="100" w:type="dxa"/>
-              <w:right w:w="100" w:type="dxa"/>
-            </w:tcMar>
-          </w:tcPr>
-          <w:p>
-            <w:proofErr w:type="gramStart"/>
-            <w:r>
-              <w:t>{{ item</w:t>
-            </w:r>
-            <w:proofErr w:type="gramEnd"/>
-            <w:r>
-              <w:t>.instructions }}</w:t>
-            </w:r>
-          </w:p>
-        </w:tc>
-        <w:tc>
-          <w:tcPr>
-            <w:tcW w:w="4193" w:type="dxa"/>
-            <w:tcBorders>
-              <w:top w:val="single" w:sz="8" w:space="0" w:color="000000"/>
-              <w:left w:val="single" w:sz="8" w:space="0" w:color="000000"/>
-              <w:bottom w:val="single" w:sz="8" w:space="0" w:color="000000"/>
-              <w:right w:val="single" w:sz="8" w:space="0" w:color="000000"/>
-            </w:tcBorders>
-            <w:shd w:val="clear" w:color="auto" w:fill="auto"/>
-            <w:tcMar>
-              <w:top w:w="100" w:type="dxa"/>
-              <w:left w:w="100" w:type="dxa"/>
-              <w:bottom w:w="100" w:type="dxa"/>
-              <w:right w:w="100" w:type="dxa"/>
-            </w:tcMar>
-          </w:tcPr>
-          <w:p>
-            <w:pPr>
-              <w:rPr>
-                <w:b/>
-                <w:bCs/>
-              </w:rPr>
-            </w:pPr>
-          </w:p>
-        </w:tc>
-        <w:tc>
-          <w:tcPr>
-            <w:tcW w:w="9736" w:type="dxa"/>
-            <w:tcBorders>
-              <w:top w:val="single" w:sz="8" w:space="0" w:color="000000"/>
-              <w:left w:val="single" w:sz="8" w:space="0" w:color="000000"/>
-              <w:bottom w:val="single" w:sz="8" w:space="0" w:color="000000"/>
-              <w:right w:val="single" w:sz="8" w:space="0" w:color="000000"/>
-            </w:tcBorders>
-            <w:shd w:val="clear" w:color="auto" w:fill="auto"/>
-            <w:tcMar>
-              <w:top w:w="100" w:type="dxa"/>
-              <w:left w:w="100" w:type="dxa"/>
-              <w:bottom w:w="100" w:type="dxa"/>
-              <w:right w:w="100" w:type="dxa"/>
-            </w:tcMar>
-          </w:tcPr>
-          <w:p/>
-        </w:tc>
-        <w:tc>
-          <w:tcPr>
-            <w:tcW w:w="0" w:type="auto"/>
-            <w:tcBorders>
-              <w:top w:val="single" w:sz="8" w:space="0" w:color="000000"/>
-              <w:left w:val="single" w:sz="8" w:space="0" w:color="000000"/>
-              <w:bottom w:val="single" w:sz="8" w:space="0" w:color="000000"/>
-              <w:right w:val="single" w:sz="8" w:space="0" w:color="000000"/>
-            </w:tcBorders>
-            <w:shd w:val="clear" w:color="auto" w:fill="auto"/>
-            <w:tcMar>
-              <w:top w:w="100" w:type="dxa"/>
-              <w:left w:w="100" w:type="dxa"/>
-              <w:bottom w:w="100" w:type="dxa"/>
-              <w:right w:w="100" w:type="dxa"/>
-            </w:tcMar>
-          </w:tcPr>
-          <w:p>
-            <w:pPr>
-              <w:rPr>
-                <w:rFonts w:hint="eastAsia"/>
                 <w:lang w:val="en-US"/>
               </w:rPr>
             </w:pPr>
-            <w:proofErr w:type="gramStart"/>
             <w:r>
               <w:rPr>
                 <w:rFonts w:hint="eastAsia"/>
@@ -784,14 +747,7 @@
               <w:t xml:space="preserve">{ </w:t>
             </w:r>
             <w:r>
-              <w:t>item</w:t>
-            </w:r>
-            <w:proofErr w:type="gramEnd"/>
-            <w:r>
-              <w:t>.</w:t>
-            </w:r>
-            <w:r>
-              <w:t>priority</w:t>
+              <w:t>item.priority</w:t>
             </w:r>
             <w:r>
               <w:t xml:space="preserve"> }</w:t>
@@ -818,7 +774,34 @@
               <w:right w:w="100" w:type="dxa"/>
             </w:tcMar>
           </w:tcPr>
-          <w:p/>
+          <w:p>
+            <w:pPr>
+              <w:rPr>
+                <w:lang w:val="en-US"/>
+              </w:rPr>
+            </w:pPr>
+            <w:r>
+              <w:rPr>
+                <w:rFonts w:hint="eastAsia"/>
+              </w:rPr>
+              <w:t>{</w:t>
+            </w:r>
+            <w:r>
+              <w:t xml:space="preserve">{ </w:t>
+            </w:r>
+            <w:r>
+              <w:t>item.</w:t>
+            </w:r>
+            <w:r>
+              <w:rPr>
+                <w:lang w:val="en-US"/>
+              </w:rPr>
+              <w:t>time_spent</w:t>
+            </w:r>
+            <w:r>
+              <w:t xml:space="preserve"> }}</w:t>
+            </w:r>
+          </w:p>
         </w:tc>
       </w:tr>
       <w:tr>
@@ -7740,6 +7723,7 @@
   <w:style w:type="character" w:default="1" w:styleId="DefaultParagraphFont">
     <w:name w:val="Default Paragraph Font"/>
     <w:uiPriority w:val="1"/>
+    <w:semiHidden/>
     <w:unhideWhenUsed/>
   </w:style>
   <w:style w:type="table" w:default="1" w:styleId="TableNormal">

</xml_diff>

<commit_message>
Fixed the rendering of status column in new template
</commit_message>
<xml_diff>
--- a/res/new_template_high.docx
+++ b/res/new_template_high.docx
@@ -111,7 +111,7 @@
     <w:p/>
     <w:tbl>
       <w:tblPr>
-        <w:tblW w:w="0" w:type="auto"/>
+        <w:tblW w:w="22481" w:type="dxa"/>
         <w:tblCellMar>
           <w:top w:w="15" w:type="dxa"/>
           <w:left w:w="15" w:type="dxa"/>
@@ -122,10 +122,10 @@
       </w:tblPr>
       <w:tblGrid>
         <w:gridCol w:w="1213"/>
-        <w:gridCol w:w="1636"/>
-        <w:gridCol w:w="2649"/>
-        <w:gridCol w:w="4007"/>
-        <w:gridCol w:w="9046"/>
+        <w:gridCol w:w="4627"/>
+        <w:gridCol w:w="3503"/>
+        <w:gridCol w:w="1581"/>
+        <w:gridCol w:w="7757"/>
         <w:gridCol w:w="1705"/>
         <w:gridCol w:w="2095"/>
       </w:tblGrid>
@@ -170,7 +170,7 @@
         </w:tc>
         <w:tc>
           <w:tcPr>
-            <w:tcW w:w="0" w:type="auto"/>
+            <w:tcW w:w="4627" w:type="dxa"/>
             <w:tcBorders>
               <w:top w:val="single" w:sz="8" w:space="0" w:color="000000"/>
               <w:left w:val="single" w:sz="8" w:space="0" w:color="000000"/>
@@ -204,7 +204,7 @@
         </w:tc>
         <w:tc>
           <w:tcPr>
-            <w:tcW w:w="2696" w:type="dxa"/>
+            <w:tcW w:w="3503" w:type="dxa"/>
             <w:tcBorders>
               <w:top w:val="single" w:sz="8" w:space="0" w:color="000000"/>
               <w:left w:val="single" w:sz="8" w:space="0" w:color="000000"/>
@@ -238,7 +238,7 @@
         </w:tc>
         <w:tc>
           <w:tcPr>
-            <w:tcW w:w="4193" w:type="dxa"/>
+            <w:tcW w:w="1581" w:type="dxa"/>
             <w:tcBorders>
               <w:top w:val="single" w:sz="8" w:space="0" w:color="000000"/>
               <w:left w:val="single" w:sz="8" w:space="0" w:color="000000"/>
@@ -272,7 +272,7 @@
         </w:tc>
         <w:tc>
           <w:tcPr>
-            <w:tcW w:w="9736" w:type="dxa"/>
+            <w:tcW w:w="7757" w:type="dxa"/>
             <w:tcBorders>
               <w:top w:val="single" w:sz="8" w:space="0" w:color="000000"/>
               <w:left w:val="single" w:sz="8" w:space="0" w:color="000000"/>
@@ -306,7 +306,7 @@
         </w:tc>
         <w:tc>
           <w:tcPr>
-            <w:tcW w:w="0" w:type="auto"/>
+            <w:tcW w:w="1705" w:type="dxa"/>
             <w:tcBorders>
               <w:top w:val="single" w:sz="8" w:space="0" w:color="000000"/>
               <w:left w:val="single" w:sz="8" w:space="0" w:color="000000"/>
@@ -340,7 +340,7 @@
         </w:tc>
         <w:tc>
           <w:tcPr>
-            <w:tcW w:w="0" w:type="auto"/>
+            <w:tcW w:w="2095" w:type="dxa"/>
             <w:tcBorders>
               <w:top w:val="single" w:sz="8" w:space="0" w:color="000000"/>
               <w:left w:val="single" w:sz="8" w:space="0" w:color="000000"/>
@@ -447,7 +447,7 @@
         </w:tc>
         <w:tc>
           <w:tcPr>
-            <w:tcW w:w="0" w:type="auto"/>
+            <w:tcW w:w="4627" w:type="dxa"/>
             <w:tcBorders>
               <w:top w:val="single" w:sz="8" w:space="0" w:color="000000"/>
               <w:left w:val="single" w:sz="8" w:space="0" w:color="000000"/>
@@ -473,7 +473,7 @@
         </w:tc>
         <w:tc>
           <w:tcPr>
-            <w:tcW w:w="2696" w:type="dxa"/>
+            <w:tcW w:w="3503" w:type="dxa"/>
             <w:tcBorders>
               <w:top w:val="single" w:sz="8" w:space="0" w:color="000000"/>
               <w:left w:val="single" w:sz="8" w:space="0" w:color="000000"/>
@@ -492,7 +492,7 @@
         </w:tc>
         <w:tc>
           <w:tcPr>
-            <w:tcW w:w="4193" w:type="dxa"/>
+            <w:tcW w:w="1581" w:type="dxa"/>
             <w:tcBorders>
               <w:top w:val="single" w:sz="8" w:space="0" w:color="000000"/>
               <w:left w:val="single" w:sz="8" w:space="0" w:color="000000"/>
@@ -518,7 +518,7 @@
         </w:tc>
         <w:tc>
           <w:tcPr>
-            <w:tcW w:w="9736" w:type="dxa"/>
+            <w:tcW w:w="7757" w:type="dxa"/>
             <w:tcBorders>
               <w:top w:val="single" w:sz="8" w:space="0" w:color="000000"/>
               <w:left w:val="single" w:sz="8" w:space="0" w:color="000000"/>
@@ -537,7 +537,7 @@
         </w:tc>
         <w:tc>
           <w:tcPr>
-            <w:tcW w:w="0" w:type="auto"/>
+            <w:tcW w:w="1705" w:type="dxa"/>
             <w:tcBorders>
               <w:top w:val="single" w:sz="8" w:space="0" w:color="000000"/>
               <w:left w:val="single" w:sz="8" w:space="0" w:color="000000"/>
@@ -556,7 +556,7 @@
         </w:tc>
         <w:tc>
           <w:tcPr>
-            <w:tcW w:w="0" w:type="auto"/>
+            <w:tcW w:w="2095" w:type="dxa"/>
             <w:tcBorders>
               <w:top w:val="single" w:sz="8" w:space="0" w:color="000000"/>
               <w:left w:val="single" w:sz="8" w:space="0" w:color="000000"/>
@@ -593,6 +593,7 @@
             </w:tcMar>
           </w:tcPr>
           <w:p>
+            <w:proofErr w:type="gramStart"/>
             <w:r>
               <w:t xml:space="preserve">{{ </w:t>
             </w:r>
@@ -608,6 +609,7 @@
               </w:rPr>
               <w:t>id</w:t>
             </w:r>
+            <w:proofErr w:type="gramEnd"/>
             <w:r>
               <w:t xml:space="preserve"> }}</w:t>
             </w:r>
@@ -615,7 +617,7 @@
         </w:tc>
         <w:tc>
           <w:tcPr>
-            <w:tcW w:w="0" w:type="auto"/>
+            <w:tcW w:w="4627" w:type="dxa"/>
             <w:tcBorders>
               <w:top w:val="single" w:sz="8" w:space="0" w:color="000000"/>
               <w:left w:val="single" w:sz="8" w:space="0" w:color="000000"/>
@@ -631,14 +633,27 @@
             </w:tcMar>
           </w:tcPr>
           <w:p>
+            <w:proofErr w:type="gramStart"/>
             <w:r>
-              <w:t>{{ item.action }}</w:t>
+              <w:t xml:space="preserve">{{ </w:t>
+            </w:r>
+            <w:proofErr w:type="spellStart"/>
+            <w:r>
+              <w:t>item</w:t>
+            </w:r>
+            <w:proofErr w:type="gramEnd"/>
+            <w:r>
+              <w:t>.action</w:t>
+            </w:r>
+            <w:proofErr w:type="spellEnd"/>
+            <w:r>
+              <w:t xml:space="preserve"> }}</w:t>
             </w:r>
           </w:p>
         </w:tc>
         <w:tc>
           <w:tcPr>
-            <w:tcW w:w="2696" w:type="dxa"/>
+            <w:tcW w:w="3503" w:type="dxa"/>
             <w:tcBorders>
               <w:top w:val="single" w:sz="8" w:space="0" w:color="000000"/>
               <w:left w:val="single" w:sz="8" w:space="0" w:color="000000"/>
@@ -654,14 +669,27 @@
             </w:tcMar>
           </w:tcPr>
           <w:p>
+            <w:proofErr w:type="gramStart"/>
             <w:r>
-              <w:t>{{ item.instructions }}</w:t>
+              <w:t xml:space="preserve">{{ </w:t>
+            </w:r>
+            <w:proofErr w:type="spellStart"/>
+            <w:r>
+              <w:t>item</w:t>
+            </w:r>
+            <w:proofErr w:type="gramEnd"/>
+            <w:r>
+              <w:t>.instructions</w:t>
+            </w:r>
+            <w:proofErr w:type="spellEnd"/>
+            <w:r>
+              <w:t xml:space="preserve"> }}</w:t>
             </w:r>
           </w:p>
         </w:tc>
         <w:tc>
           <w:tcPr>
-            <w:tcW w:w="4193" w:type="dxa"/>
+            <w:tcW w:w="1581" w:type="dxa"/>
             <w:tcBorders>
               <w:top w:val="single" w:sz="8" w:space="0" w:color="000000"/>
               <w:left w:val="single" w:sz="8" w:space="0" w:color="000000"/>
@@ -677,14 +705,30 @@
             </w:tcMar>
           </w:tcPr>
           <w:p>
+            <w:proofErr w:type="gramStart"/>
             <w:r>
-              <w:t>{{ item.instructions}}</w:t>
+              <w:t xml:space="preserve">{{ </w:t>
+            </w:r>
+            <w:proofErr w:type="spellStart"/>
+            <w:r>
+              <w:t>item</w:t>
+            </w:r>
+            <w:proofErr w:type="gramEnd"/>
+            <w:r>
+              <w:t>.</w:t>
+            </w:r>
+            <w:r>
+              <w:t>status</w:t>
+            </w:r>
+            <w:proofErr w:type="spellEnd"/>
+            <w:r>
+              <w:t>}}</w:t>
             </w:r>
           </w:p>
         </w:tc>
         <w:tc>
           <w:tcPr>
-            <w:tcW w:w="9736" w:type="dxa"/>
+            <w:tcW w:w="7757" w:type="dxa"/>
             <w:tcBorders>
               <w:top w:val="single" w:sz="8" w:space="0" w:color="000000"/>
               <w:left w:val="single" w:sz="8" w:space="0" w:color="000000"/>
@@ -700,12 +744,22 @@
             </w:tcMar>
           </w:tcPr>
           <w:p>
+            <w:proofErr w:type="gramStart"/>
             <w:r>
-              <w:t>{{ item.</w:t>
+              <w:t xml:space="preserve">{{ </w:t>
+            </w:r>
+            <w:proofErr w:type="spellStart"/>
+            <w:r>
+              <w:t>item</w:t>
+            </w:r>
+            <w:proofErr w:type="gramEnd"/>
+            <w:r>
+              <w:t>.</w:t>
             </w:r>
             <w:r>
               <w:t>comments</w:t>
             </w:r>
+            <w:proofErr w:type="spellEnd"/>
             <w:r>
               <w:t xml:space="preserve"> </w:t>
             </w:r>
@@ -716,7 +770,7 @@
         </w:tc>
         <w:tc>
           <w:tcPr>
-            <w:tcW w:w="0" w:type="auto"/>
+            <w:tcW w:w="1705" w:type="dxa"/>
             <w:tcBorders>
               <w:top w:val="single" w:sz="8" w:space="0" w:color="000000"/>
               <w:left w:val="single" w:sz="8" w:space="0" w:color="000000"/>
@@ -737,6 +791,7 @@
                 <w:lang w:val="en-US"/>
               </w:rPr>
             </w:pPr>
+            <w:proofErr w:type="gramStart"/>
             <w:r>
               <w:rPr>
                 <w:rFonts w:hint="eastAsia"/>
@@ -746,9 +801,15 @@
             <w:r>
               <w:t xml:space="preserve">{ </w:t>
             </w:r>
+            <w:proofErr w:type="spellStart"/>
             <w:r>
-              <w:t>item.priority</w:t>
+              <w:t>item</w:t>
             </w:r>
+            <w:proofErr w:type="gramEnd"/>
+            <w:r>
+              <w:t>.priority</w:t>
+            </w:r>
+            <w:proofErr w:type="spellEnd"/>
             <w:r>
               <w:t xml:space="preserve"> }</w:t>
             </w:r>
@@ -759,7 +820,7 @@
         </w:tc>
         <w:tc>
           <w:tcPr>
-            <w:tcW w:w="0" w:type="auto"/>
+            <w:tcW w:w="2095" w:type="dxa"/>
             <w:tcBorders>
               <w:top w:val="single" w:sz="8" w:space="0" w:color="000000"/>
               <w:left w:val="single" w:sz="8" w:space="0" w:color="000000"/>
@@ -780,6 +841,7 @@
                 <w:lang w:val="en-US"/>
               </w:rPr>
             </w:pPr>
+            <w:proofErr w:type="gramStart"/>
             <w:r>
               <w:rPr>
                 <w:rFonts w:hint="eastAsia"/>
@@ -790,14 +852,20 @@
               <w:t xml:space="preserve">{ </w:t>
             </w:r>
             <w:r>
-              <w:t>item.</w:t>
+              <w:t>item</w:t>
             </w:r>
+            <w:proofErr w:type="gramEnd"/>
+            <w:r>
+              <w:t>.</w:t>
+            </w:r>
+            <w:proofErr w:type="spellStart"/>
             <w:r>
               <w:rPr>
                 <w:lang w:val="en-US"/>
               </w:rPr>
               <w:t>time_spent</w:t>
             </w:r>
+            <w:proofErr w:type="spellEnd"/>
             <w:r>
               <w:t xml:space="preserve"> }}</w:t>
             </w:r>
@@ -855,7 +923,7 @@
         </w:tc>
         <w:tc>
           <w:tcPr>
-            <w:tcW w:w="0" w:type="auto"/>
+            <w:tcW w:w="4627" w:type="dxa"/>
             <w:tcBorders>
               <w:top w:val="single" w:sz="8" w:space="0" w:color="000000"/>
               <w:left w:val="single" w:sz="8" w:space="0" w:color="000000"/>
@@ -881,7 +949,7 @@
         </w:tc>
         <w:tc>
           <w:tcPr>
-            <w:tcW w:w="2696" w:type="dxa"/>
+            <w:tcW w:w="3503" w:type="dxa"/>
             <w:tcBorders>
               <w:top w:val="single" w:sz="8" w:space="0" w:color="000000"/>
               <w:left w:val="single" w:sz="8" w:space="0" w:color="000000"/>
@@ -900,7 +968,7 @@
         </w:tc>
         <w:tc>
           <w:tcPr>
-            <w:tcW w:w="4193" w:type="dxa"/>
+            <w:tcW w:w="1581" w:type="dxa"/>
             <w:tcBorders>
               <w:top w:val="single" w:sz="8" w:space="0" w:color="000000"/>
               <w:left w:val="single" w:sz="8" w:space="0" w:color="000000"/>
@@ -926,7 +994,7 @@
         </w:tc>
         <w:tc>
           <w:tcPr>
-            <w:tcW w:w="9736" w:type="dxa"/>
+            <w:tcW w:w="7757" w:type="dxa"/>
             <w:tcBorders>
               <w:top w:val="single" w:sz="8" w:space="0" w:color="000000"/>
               <w:left w:val="single" w:sz="8" w:space="0" w:color="000000"/>
@@ -945,7 +1013,7 @@
         </w:tc>
         <w:tc>
           <w:tcPr>
-            <w:tcW w:w="0" w:type="auto"/>
+            <w:tcW w:w="1705" w:type="dxa"/>
             <w:tcBorders>
               <w:top w:val="single" w:sz="8" w:space="0" w:color="000000"/>
               <w:left w:val="single" w:sz="8" w:space="0" w:color="000000"/>
@@ -964,7 +1032,7 @@
         </w:tc>
         <w:tc>
           <w:tcPr>
-            <w:tcW w:w="0" w:type="auto"/>
+            <w:tcW w:w="2095" w:type="dxa"/>
             <w:tcBorders>
               <w:top w:val="single" w:sz="8" w:space="0" w:color="000000"/>
               <w:left w:val="single" w:sz="8" w:space="0" w:color="000000"/>

</xml_diff>

<commit_message>
Workable version for exporting the YAML to DOCX.
TODO:
1. Resume the feature where if required fields are did not input then will block export
</commit_message>
<xml_diff>
--- a/res/new_template_high.docx
+++ b/res/new_template_high.docx
@@ -94,6 +94,428 @@
             <w:pPr>
               <w:spacing w:line="480" w:lineRule="auto"/>
             </w:pPr>
+            <w:r>
+              <w:rPr>
+                <w:b/>
+                <w:bCs/>
+              </w:rPr>
+              <w:t>Ticket number:</w:t>
+            </w:r>
+            <w:r>
+              <w:t xml:space="preserve"> </w:t>
+            </w:r>
+            <w:proofErr w:type="gramStart"/>
+            <w:r>
+              <w:t xml:space="preserve">{{ </w:t>
+            </w:r>
+            <w:proofErr w:type="spellStart"/>
+            <w:r>
+              <w:t>metadata</w:t>
+            </w:r>
+            <w:proofErr w:type="gramEnd"/>
+            <w:r>
+              <w:t>.ticket_</w:t>
+            </w:r>
+            <w:proofErr w:type="gramStart"/>
+            <w:r>
+              <w:t>number</w:t>
+            </w:r>
+            <w:proofErr w:type="spellEnd"/>
+            <w:r>
+              <w:t xml:space="preserve"> }</w:t>
+            </w:r>
+            <w:proofErr w:type="gramEnd"/>
+            <w:r>
+              <w:t>}</w:t>
+            </w:r>
+          </w:p>
+          <w:p>
+            <w:pPr>
+              <w:spacing w:line="480" w:lineRule="auto"/>
+            </w:pPr>
+            <w:r>
+              <w:rPr>
+                <w:b/>
+                <w:bCs/>
+              </w:rPr>
+              <w:t>Curator name:</w:t>
+            </w:r>
+            <w:r>
+              <w:t xml:space="preserve"> </w:t>
+            </w:r>
+            <w:proofErr w:type="gramStart"/>
+            <w:r>
+              <w:t xml:space="preserve">{{ </w:t>
+            </w:r>
+            <w:proofErr w:type="spellStart"/>
+            <w:r>
+              <w:t>metadata</w:t>
+            </w:r>
+            <w:proofErr w:type="gramEnd"/>
+            <w:r>
+              <w:t>.curator_</w:t>
+            </w:r>
+            <w:proofErr w:type="gramStart"/>
+            <w:r>
+              <w:t>name</w:t>
+            </w:r>
+            <w:proofErr w:type="spellEnd"/>
+            <w:r>
+              <w:t xml:space="preserve"> }</w:t>
+            </w:r>
+            <w:proofErr w:type="gramEnd"/>
+            <w:r>
+              <w:t>}</w:t>
+            </w:r>
+          </w:p>
+          <w:p>
+            <w:pPr>
+              <w:spacing w:line="480" w:lineRule="auto"/>
+            </w:pPr>
+            <w:r>
+              <w:rPr>
+                <w:b/>
+                <w:bCs/>
+              </w:rPr>
+              <w:t>Curator email:</w:t>
+            </w:r>
+            <w:r>
+              <w:t xml:space="preserve"> </w:t>
+            </w:r>
+            <w:proofErr w:type="gramStart"/>
+            <w:r>
+              <w:t xml:space="preserve">{{ </w:t>
+            </w:r>
+            <w:proofErr w:type="spellStart"/>
+            <w:r>
+              <w:t>metadata</w:t>
+            </w:r>
+            <w:proofErr w:type="gramEnd"/>
+            <w:r>
+              <w:t>.curator_</w:t>
+            </w:r>
+            <w:proofErr w:type="gramStart"/>
+            <w:r>
+              <w:t>email</w:t>
+            </w:r>
+            <w:proofErr w:type="spellEnd"/>
+            <w:r>
+              <w:t xml:space="preserve"> }</w:t>
+            </w:r>
+            <w:proofErr w:type="gramEnd"/>
+            <w:r>
+              <w:t>}</w:t>
+            </w:r>
+          </w:p>
+          <w:p>
+            <w:pPr>
+              <w:spacing w:line="480" w:lineRule="auto"/>
+              <w:rPr>
+                <w:lang w:val="en-US"/>
+              </w:rPr>
+            </w:pPr>
+            <w:r>
+              <w:rPr>
+                <w:b/>
+                <w:bCs/>
+              </w:rPr>
+              <w:t>Dataset title:</w:t>
+            </w:r>
+            <w:r>
+              <w:t xml:space="preserve"> </w:t>
+            </w:r>
+            <w:proofErr w:type="gramStart"/>
+            <w:r>
+              <w:t xml:space="preserve">{{ </w:t>
+            </w:r>
+            <w:r>
+              <w:t>metadata</w:t>
+            </w:r>
+            <w:proofErr w:type="gramEnd"/>
+            <w:r>
+              <w:t>.</w:t>
+            </w:r>
+            <w:proofErr w:type="spellStart"/>
+            <w:r>
+              <w:rPr>
+                <w:lang w:val="en-US"/>
+              </w:rPr>
+              <w:t>dataset_</w:t>
+            </w:r>
+            <w:proofErr w:type="gramStart"/>
+            <w:r>
+              <w:rPr>
+                <w:lang w:val="en-US"/>
+              </w:rPr>
+              <w:t>title</w:t>
+            </w:r>
+            <w:proofErr w:type="spellEnd"/>
+            <w:r>
+              <w:t xml:space="preserve"> }</w:t>
+            </w:r>
+            <w:proofErr w:type="gramEnd"/>
+            <w:r>
+              <w:t>}</w:t>
+            </w:r>
+          </w:p>
+          <w:p>
+            <w:pPr>
+              <w:spacing w:line="480" w:lineRule="auto"/>
+              <w:rPr>
+                <w:lang w:val="en-US"/>
+              </w:rPr>
+            </w:pPr>
+            <w:r>
+              <w:rPr>
+                <w:b/>
+                <w:bCs/>
+              </w:rPr>
+              <w:t>Dataset persistent identifier:</w:t>
+            </w:r>
+            <w:r>
+              <w:t xml:space="preserve"> </w:t>
+            </w:r>
+            <w:proofErr w:type="gramStart"/>
+            <w:r>
+              <w:t xml:space="preserve">{{ </w:t>
+            </w:r>
+            <w:r>
+              <w:t>metadata</w:t>
+            </w:r>
+            <w:proofErr w:type="gramEnd"/>
+            <w:r>
+              <w:t>.</w:t>
+            </w:r>
+            <w:proofErr w:type="spellStart"/>
+            <w:r>
+              <w:rPr>
+                <w:lang w:val="en-US"/>
+              </w:rPr>
+              <w:t>dataset_</w:t>
+            </w:r>
+            <w:proofErr w:type="gramStart"/>
+            <w:r>
+              <w:rPr>
+                <w:lang w:val="en-US"/>
+              </w:rPr>
+              <w:t>pid</w:t>
+            </w:r>
+            <w:proofErr w:type="spellEnd"/>
+            <w:r>
+              <w:t xml:space="preserve"> }</w:t>
+            </w:r>
+            <w:proofErr w:type="gramEnd"/>
+            <w:r>
+              <w:t>}</w:t>
+            </w:r>
+          </w:p>
+          <w:p>
+            <w:pPr>
+              <w:spacing w:line="480" w:lineRule="auto"/>
+              <w:rPr>
+                <w:lang w:val="en-US"/>
+              </w:rPr>
+            </w:pPr>
+            <w:r>
+              <w:rPr>
+                <w:b/>
+                <w:bCs/>
+              </w:rPr>
+              <w:t>Dataset ID (versioned):</w:t>
+            </w:r>
+            <w:r>
+              <w:t xml:space="preserve"> </w:t>
+            </w:r>
+            <w:proofErr w:type="gramStart"/>
+            <w:r>
+              <w:t>{{</w:t>
+            </w:r>
+            <w:r>
+              <w:t xml:space="preserve"> </w:t>
+            </w:r>
+            <w:r>
+              <w:t>metadata</w:t>
+            </w:r>
+            <w:proofErr w:type="gramEnd"/>
+            <w:r>
+              <w:t>.</w:t>
+            </w:r>
+            <w:proofErr w:type="spellStart"/>
+            <w:r>
+              <w:rPr>
+                <w:lang w:val="en-US"/>
+              </w:rPr>
+              <w:t>dataset_</w:t>
+            </w:r>
+            <w:proofErr w:type="gramStart"/>
+            <w:r>
+              <w:rPr>
+                <w:lang w:val="en-US"/>
+              </w:rPr>
+              <w:t>id</w:t>
+            </w:r>
+            <w:proofErr w:type="spellEnd"/>
+            <w:r>
+              <w:t xml:space="preserve"> }</w:t>
+            </w:r>
+            <w:proofErr w:type="gramEnd"/>
+            <w:r>
+              <w:t>}</w:t>
+            </w:r>
+          </w:p>
+          <w:p>
+            <w:pPr>
+              <w:spacing w:line="480" w:lineRule="auto"/>
+              <w:rPr>
+                <w:lang w:val="en-US"/>
+              </w:rPr>
+            </w:pPr>
+            <w:r>
+              <w:rPr>
+                <w:b/>
+                <w:bCs/>
+              </w:rPr>
+              <w:t>Dataset access URL:</w:t>
+            </w:r>
+            <w:r>
+              <w:t xml:space="preserve"> </w:t>
+            </w:r>
+            <w:proofErr w:type="gramStart"/>
+            <w:r>
+              <w:t>{{</w:t>
+            </w:r>
+            <w:r>
+              <w:t xml:space="preserve"> metadata</w:t>
+            </w:r>
+            <w:proofErr w:type="gramEnd"/>
+            <w:r>
+              <w:t>.</w:t>
+            </w:r>
+            <w:proofErr w:type="spellStart"/>
+            <w:r>
+              <w:rPr>
+                <w:lang w:val="en-US"/>
+              </w:rPr>
+              <w:t>dataset_</w:t>
+            </w:r>
+            <w:proofErr w:type="gramStart"/>
+            <w:r>
+              <w:rPr>
+                <w:lang w:val="en-US"/>
+              </w:rPr>
+              <w:t>url</w:t>
+            </w:r>
+            <w:proofErr w:type="spellEnd"/>
+            <w:r>
+              <w:t xml:space="preserve"> }</w:t>
+            </w:r>
+            <w:proofErr w:type="gramEnd"/>
+            <w:r>
+              <w:t>}</w:t>
+            </w:r>
+          </w:p>
+          <w:p>
+            <w:pPr>
+              <w:spacing w:line="480" w:lineRule="auto"/>
+              <w:rPr>
+                <w:lang w:val="en-US"/>
+              </w:rPr>
+            </w:pPr>
+            <w:r>
+              <w:rPr>
+                <w:b/>
+                <w:bCs/>
+              </w:rPr>
+              <w:t>Log initial generated date:</w:t>
+            </w:r>
+            <w:r>
+              <w:t xml:space="preserve"> </w:t>
+            </w:r>
+            <w:proofErr w:type="gramStart"/>
+            <w:r>
+              <w:t xml:space="preserve">{{ </w:t>
+            </w:r>
+            <w:r>
+              <w:t>metadata</w:t>
+            </w:r>
+            <w:r>
+              <w:t>.</w:t>
+            </w:r>
+            <w:proofErr w:type="spellStart"/>
+            <w:r>
+              <w:rPr>
+                <w:lang w:val="en-US"/>
+              </w:rPr>
+              <w:t>log</w:t>
+            </w:r>
+            <w:proofErr w:type="gramEnd"/>
+            <w:r>
+              <w:rPr>
+                <w:lang w:val="en-US"/>
+              </w:rPr>
+              <w:t>_updated_</w:t>
+            </w:r>
+            <w:proofErr w:type="gramStart"/>
+            <w:r>
+              <w:rPr>
+                <w:lang w:val="en-US"/>
+              </w:rPr>
+              <w:t>date</w:t>
+            </w:r>
+            <w:proofErr w:type="spellEnd"/>
+            <w:r>
+              <w:t xml:space="preserve"> }</w:t>
+            </w:r>
+            <w:proofErr w:type="gramEnd"/>
+            <w:r>
+              <w:t>}</w:t>
+            </w:r>
+          </w:p>
+          <w:p>
+            <w:pPr>
+              <w:spacing w:line="480" w:lineRule="auto"/>
+            </w:pPr>
+            <w:r>
+              <w:rPr>
+                <w:b/>
+                <w:bCs/>
+              </w:rPr>
+              <w:t>Log last updated date:</w:t>
+            </w:r>
+            <w:r>
+              <w:t xml:space="preserve"> </w:t>
+            </w:r>
+            <w:proofErr w:type="gramStart"/>
+            <w:r>
+              <w:t xml:space="preserve">{{ </w:t>
+            </w:r>
+            <w:proofErr w:type="spellStart"/>
+            <w:r>
+              <w:t>metadata</w:t>
+            </w:r>
+            <w:r>
+              <w:t>.</w:t>
+            </w:r>
+            <w:r>
+              <w:t>l</w:t>
+            </w:r>
+            <w:r>
+              <w:rPr>
+                <w:lang w:val="en-US"/>
+              </w:rPr>
+              <w:t>og</w:t>
+            </w:r>
+            <w:proofErr w:type="gramEnd"/>
+            <w:r>
+              <w:rPr>
+                <w:lang w:val="en-US"/>
+              </w:rPr>
+              <w:t>_initial_date</w:t>
+            </w:r>
+            <w:proofErr w:type="spellEnd"/>
+            <w:r>
+              <w:t xml:space="preserve"> }}</w:t>
+            </w:r>
           </w:p>
         </w:tc>
         <w:tc>
@@ -433,7 +855,21 @@
                 <w:b/>
                 <w:bCs/>
               </w:rPr>
-              <w:t xml:space="preserve"> for item in data %}</w:t>
+              <w:t xml:space="preserve"> for item in </w:t>
+            </w:r>
+            <w:r>
+              <w:rPr>
+                <w:b/>
+                <w:bCs/>
+              </w:rPr>
+              <w:t>checklist</w:t>
+            </w:r>
+            <w:r>
+              <w:rPr>
+                <w:b/>
+                <w:bCs/>
+              </w:rPr>
+              <w:t xml:space="preserve"> %}</w:t>
             </w:r>
             <w:r>
               <w:rPr>
@@ -7791,7 +8227,6 @@
   <w:style w:type="character" w:default="1" w:styleId="DefaultParagraphFont">
     <w:name w:val="Default Paragraph Font"/>
     <w:uiPriority w:val="1"/>
-    <w:semiHidden/>
     <w:unhideWhenUsed/>
   </w:style>
   <w:style w:type="table" w:default="1" w:styleId="TableNormal">

</xml_diff>

<commit_message>
Updated docx template to sync with the layout of web checklist
</commit_message>
<xml_diff>
--- a/res/new_template_high.docx
+++ b/res/new_template_high.docx
@@ -533,7 +533,7 @@
     <w:p/>
     <w:tbl>
       <w:tblPr>
-        <w:tblW w:w="22481" w:type="dxa"/>
+        <w:tblW w:w="22559" w:type="dxa"/>
         <w:tblCellMar>
           <w:top w:w="15" w:type="dxa"/>
           <w:left w:w="15" w:type="dxa"/>
@@ -544,10 +544,9 @@
       </w:tblPr>
       <w:tblGrid>
         <w:gridCol w:w="1213"/>
-        <w:gridCol w:w="4627"/>
-        <w:gridCol w:w="3503"/>
-        <w:gridCol w:w="1581"/>
-        <w:gridCol w:w="7757"/>
+        <w:gridCol w:w="5581"/>
+        <w:gridCol w:w="1862"/>
+        <w:gridCol w:w="10103"/>
         <w:gridCol w:w="1705"/>
         <w:gridCol w:w="2095"/>
       </w:tblGrid>
@@ -592,7 +591,7 @@
         </w:tc>
         <w:tc>
           <w:tcPr>
-            <w:tcW w:w="4627" w:type="dxa"/>
+            <w:tcW w:w="5581" w:type="dxa"/>
             <w:tcBorders>
               <w:top w:val="single" w:sz="8" w:space="0" w:color="000000"/>
               <w:left w:val="single" w:sz="8" w:space="0" w:color="000000"/>
@@ -626,7 +625,7 @@
         </w:tc>
         <w:tc>
           <w:tcPr>
-            <w:tcW w:w="3503" w:type="dxa"/>
+            <w:tcW w:w="1862" w:type="dxa"/>
             <w:tcBorders>
               <w:top w:val="single" w:sz="8" w:space="0" w:color="000000"/>
               <w:left w:val="single" w:sz="8" w:space="0" w:color="000000"/>
@@ -654,47 +653,13 @@
                 <w:b/>
                 <w:bCs/>
               </w:rPr>
-              <w:t>Instructions</w:t>
+              <w:t>Status</w:t>
             </w:r>
           </w:p>
         </w:tc>
         <w:tc>
           <w:tcPr>
-            <w:tcW w:w="1581" w:type="dxa"/>
-            <w:tcBorders>
-              <w:top w:val="single" w:sz="8" w:space="0" w:color="000000"/>
-              <w:left w:val="single" w:sz="8" w:space="0" w:color="000000"/>
-              <w:bottom w:val="single" w:sz="8" w:space="0" w:color="000000"/>
-              <w:right w:val="single" w:sz="8" w:space="0" w:color="000000"/>
-            </w:tcBorders>
-            <w:shd w:val="clear" w:color="auto" w:fill="A4C2F4"/>
-            <w:tcMar>
-              <w:top w:w="100" w:type="dxa"/>
-              <w:left w:w="100" w:type="dxa"/>
-              <w:bottom w:w="100" w:type="dxa"/>
-              <w:right w:w="100" w:type="dxa"/>
-            </w:tcMar>
-            <w:hideMark/>
-          </w:tcPr>
-          <w:p>
-            <w:pPr>
-              <w:rPr>
-                <w:b/>
-                <w:bCs/>
-              </w:rPr>
-            </w:pPr>
-            <w:r>
-              <w:rPr>
-                <w:b/>
-                <w:bCs/>
-              </w:rPr>
-              <w:t>Status</w:t>
-            </w:r>
-          </w:p>
-        </w:tc>
-        <w:tc>
-          <w:tcPr>
-            <w:tcW w:w="7757" w:type="dxa"/>
+            <w:tcW w:w="10103" w:type="dxa"/>
             <w:tcBorders>
               <w:top w:val="single" w:sz="8" w:space="0" w:color="000000"/>
               <w:left w:val="single" w:sz="8" w:space="0" w:color="000000"/>
@@ -883,7 +848,7 @@
         </w:tc>
         <w:tc>
           <w:tcPr>
-            <w:tcW w:w="4627" w:type="dxa"/>
+            <w:tcW w:w="5581" w:type="dxa"/>
             <w:tcBorders>
               <w:top w:val="single" w:sz="8" w:space="0" w:color="000000"/>
               <w:left w:val="single" w:sz="8" w:space="0" w:color="000000"/>
@@ -909,26 +874,7 @@
         </w:tc>
         <w:tc>
           <w:tcPr>
-            <w:tcW w:w="3503" w:type="dxa"/>
-            <w:tcBorders>
-              <w:top w:val="single" w:sz="8" w:space="0" w:color="000000"/>
-              <w:left w:val="single" w:sz="8" w:space="0" w:color="000000"/>
-              <w:bottom w:val="single" w:sz="8" w:space="0" w:color="000000"/>
-              <w:right w:val="single" w:sz="8" w:space="0" w:color="000000"/>
-            </w:tcBorders>
-            <w:shd w:val="clear" w:color="auto" w:fill="auto"/>
-            <w:tcMar>
-              <w:top w:w="100" w:type="dxa"/>
-              <w:left w:w="100" w:type="dxa"/>
-              <w:bottom w:w="100" w:type="dxa"/>
-              <w:right w:w="100" w:type="dxa"/>
-            </w:tcMar>
-          </w:tcPr>
-          <w:p/>
-        </w:tc>
-        <w:tc>
-          <w:tcPr>
-            <w:tcW w:w="1581" w:type="dxa"/>
+            <w:tcW w:w="1862" w:type="dxa"/>
             <w:tcBorders>
               <w:top w:val="single" w:sz="8" w:space="0" w:color="000000"/>
               <w:left w:val="single" w:sz="8" w:space="0" w:color="000000"/>
@@ -954,7 +900,7 @@
         </w:tc>
         <w:tc>
           <w:tcPr>
-            <w:tcW w:w="7757" w:type="dxa"/>
+            <w:tcW w:w="10103" w:type="dxa"/>
             <w:tcBorders>
               <w:top w:val="single" w:sz="8" w:space="0" w:color="000000"/>
               <w:left w:val="single" w:sz="8" w:space="0" w:color="000000"/>
@@ -1037,13 +983,7 @@
               <w:rPr>
                 <w:rFonts w:hint="eastAsia"/>
               </w:rPr>
-              <w:t>item.</w:t>
-            </w:r>
-            <w:r>
-              <w:rPr>
-                <w:rFonts w:hint="eastAsia"/>
-              </w:rPr>
-              <w:t>id</w:t>
+              <w:t>item.id</w:t>
             </w:r>
             <w:proofErr w:type="gramEnd"/>
             <w:r>
@@ -1053,7 +993,7 @@
         </w:tc>
         <w:tc>
           <w:tcPr>
-            <w:tcW w:w="4627" w:type="dxa"/>
+            <w:tcW w:w="5581" w:type="dxa"/>
             <w:tcBorders>
               <w:top w:val="single" w:sz="8" w:space="0" w:color="000000"/>
               <w:left w:val="single" w:sz="8" w:space="0" w:color="000000"/>
@@ -1079,17 +1019,80 @@
             </w:r>
             <w:proofErr w:type="gramEnd"/>
             <w:r>
-              <w:t>.action</w:t>
+              <w:t>.</w:t>
+            </w:r>
+            <w:proofErr w:type="gramStart"/>
+            <w:r>
+              <w:t>action</w:t>
             </w:r>
             <w:proofErr w:type="spellEnd"/>
             <w:r>
+              <w:t xml:space="preserve"> }</w:t>
+            </w:r>
+            <w:proofErr w:type="gramEnd"/>
+            <w:r>
+              <w:t>}</w:t>
+            </w:r>
+          </w:p>
+          <w:p>
+            <w:pPr>
+              <w:rPr>
+                <w:i/>
+                <w:iCs/>
+                <w:color w:val="171717" w:themeColor="background2" w:themeShade="1A"/>
+                <w:sz w:val="20"/>
+                <w:szCs w:val="20"/>
+              </w:rPr>
+            </w:pPr>
+            <w:proofErr w:type="gramStart"/>
+            <w:r>
+              <w:rPr>
+                <w:i/>
+                <w:iCs/>
+                <w:color w:val="171717" w:themeColor="background2" w:themeShade="1A"/>
+                <w:sz w:val="20"/>
+                <w:szCs w:val="20"/>
+              </w:rPr>
+              <w:t xml:space="preserve">{{ </w:t>
+            </w:r>
+            <w:proofErr w:type="spellStart"/>
+            <w:r>
+              <w:rPr>
+                <w:i/>
+                <w:iCs/>
+                <w:color w:val="171717" w:themeColor="background2" w:themeShade="1A"/>
+                <w:sz w:val="20"/>
+                <w:szCs w:val="20"/>
+              </w:rPr>
+              <w:t>item</w:t>
+            </w:r>
+            <w:proofErr w:type="gramEnd"/>
+            <w:r>
+              <w:rPr>
+                <w:i/>
+                <w:iCs/>
+                <w:color w:val="171717" w:themeColor="background2" w:themeShade="1A"/>
+                <w:sz w:val="20"/>
+                <w:szCs w:val="20"/>
+              </w:rPr>
+              <w:t>.instructions</w:t>
+            </w:r>
+            <w:proofErr w:type="spellEnd"/>
+            <w:r>
+              <w:rPr>
+                <w:i/>
+                <w:iCs/>
+                <w:color w:val="171717" w:themeColor="background2" w:themeShade="1A"/>
+                <w:sz w:val="20"/>
+                <w:szCs w:val="20"/>
+              </w:rPr>
               <w:t xml:space="preserve"> }}</w:t>
             </w:r>
           </w:p>
         </w:tc>
         <w:tc>
           <w:tcPr>
-            <w:tcW w:w="3503" w:type="dxa"/>
+            <w:tcW w:w="1862" w:type="dxa"/>
             <w:tcBorders>
               <w:top w:val="single" w:sz="8" w:space="0" w:color="000000"/>
               <w:left w:val="single" w:sz="8" w:space="0" w:color="000000"/>
@@ -1115,56 +1118,20 @@
             </w:r>
             <w:proofErr w:type="gramEnd"/>
             <w:r>
-              <w:t>.instructions</w:t>
+              <w:t>.</w:t>
+            </w:r>
+            <w:r>
+              <w:t>status</w:t>
             </w:r>
             <w:proofErr w:type="spellEnd"/>
             <w:r>
-              <w:t xml:space="preserve"> }}</w:t>
+              <w:t>}}</w:t>
             </w:r>
           </w:p>
         </w:tc>
         <w:tc>
           <w:tcPr>
-            <w:tcW w:w="1581" w:type="dxa"/>
-            <w:tcBorders>
-              <w:top w:val="single" w:sz="8" w:space="0" w:color="000000"/>
-              <w:left w:val="single" w:sz="8" w:space="0" w:color="000000"/>
-              <w:bottom w:val="single" w:sz="8" w:space="0" w:color="000000"/>
-              <w:right w:val="single" w:sz="8" w:space="0" w:color="000000"/>
-            </w:tcBorders>
-            <w:shd w:val="clear" w:color="auto" w:fill="auto"/>
-            <w:tcMar>
-              <w:top w:w="100" w:type="dxa"/>
-              <w:left w:w="100" w:type="dxa"/>
-              <w:bottom w:w="100" w:type="dxa"/>
-              <w:right w:w="100" w:type="dxa"/>
-            </w:tcMar>
-          </w:tcPr>
-          <w:p>
-            <w:proofErr w:type="gramStart"/>
-            <w:r>
-              <w:t xml:space="preserve">{{ </w:t>
-            </w:r>
-            <w:proofErr w:type="spellStart"/>
-            <w:r>
-              <w:t>item</w:t>
-            </w:r>
-            <w:proofErr w:type="gramEnd"/>
-            <w:r>
-              <w:t>.</w:t>
-            </w:r>
-            <w:r>
-              <w:t>status</w:t>
-            </w:r>
-            <w:proofErr w:type="spellEnd"/>
-            <w:r>
-              <w:t>}}</w:t>
-            </w:r>
-          </w:p>
-        </w:tc>
-        <w:tc>
-          <w:tcPr>
-            <w:tcW w:w="7757" w:type="dxa"/>
+            <w:tcW w:w="10103" w:type="dxa"/>
             <w:tcBorders>
               <w:top w:val="single" w:sz="8" w:space="0" w:color="000000"/>
               <w:left w:val="single" w:sz="8" w:space="0" w:color="000000"/>
@@ -1247,10 +1214,7 @@
             </w:r>
             <w:proofErr w:type="spellEnd"/>
             <w:r>
-              <w:t xml:space="preserve"> }</w:t>
-            </w:r>
-            <w:r>
-              <w:t>}</w:t>
+              <w:t xml:space="preserve"> }}</w:t>
             </w:r>
           </w:p>
         </w:tc>
@@ -1353,13 +1317,29 @@
                 <w:b/>
                 <w:bCs/>
               </w:rPr>
-              <w:t xml:space="preserve"> endfor %}</w:t>
+              <w:t xml:space="preserve"> </w:t>
+            </w:r>
+            <w:proofErr w:type="spellStart"/>
+            <w:r>
+              <w:rPr>
+                <w:b/>
+                <w:bCs/>
+              </w:rPr>
+              <w:t>endfor</w:t>
+            </w:r>
+            <w:proofErr w:type="spellEnd"/>
+            <w:r>
+              <w:rPr>
+                <w:b/>
+                <w:bCs/>
+              </w:rPr>
+              <w:t xml:space="preserve"> %}</w:t>
             </w:r>
           </w:p>
         </w:tc>
         <w:tc>
           <w:tcPr>
-            <w:tcW w:w="4627" w:type="dxa"/>
+            <w:tcW w:w="5581" w:type="dxa"/>
             <w:tcBorders>
               <w:top w:val="single" w:sz="8" w:space="0" w:color="000000"/>
               <w:left w:val="single" w:sz="8" w:space="0" w:color="000000"/>
@@ -1385,26 +1365,7 @@
         </w:tc>
         <w:tc>
           <w:tcPr>
-            <w:tcW w:w="3503" w:type="dxa"/>
-            <w:tcBorders>
-              <w:top w:val="single" w:sz="8" w:space="0" w:color="000000"/>
-              <w:left w:val="single" w:sz="8" w:space="0" w:color="000000"/>
-              <w:bottom w:val="single" w:sz="8" w:space="0" w:color="000000"/>
-              <w:right w:val="single" w:sz="8" w:space="0" w:color="000000"/>
-            </w:tcBorders>
-            <w:shd w:val="clear" w:color="auto" w:fill="auto"/>
-            <w:tcMar>
-              <w:top w:w="100" w:type="dxa"/>
-              <w:left w:w="100" w:type="dxa"/>
-              <w:bottom w:w="100" w:type="dxa"/>
-              <w:right w:w="100" w:type="dxa"/>
-            </w:tcMar>
-          </w:tcPr>
-          <w:p/>
-        </w:tc>
-        <w:tc>
-          <w:tcPr>
-            <w:tcW w:w="1581" w:type="dxa"/>
+            <w:tcW w:w="1862" w:type="dxa"/>
             <w:tcBorders>
               <w:top w:val="single" w:sz="8" w:space="0" w:color="000000"/>
               <w:left w:val="single" w:sz="8" w:space="0" w:color="000000"/>
@@ -1430,7 +1391,7 @@
         </w:tc>
         <w:tc>
           <w:tcPr>
-            <w:tcW w:w="7757" w:type="dxa"/>
+            <w:tcW w:w="10103" w:type="dxa"/>
             <w:tcBorders>
               <w:top w:val="single" w:sz="8" w:space="0" w:color="000000"/>
               <w:left w:val="single" w:sz="8" w:space="0" w:color="000000"/>
@@ -8227,6 +8188,7 @@
   <w:style w:type="character" w:default="1" w:styleId="DefaultParagraphFont">
     <w:name w:val="Default Paragraph Font"/>
     <w:uiPriority w:val="1"/>
+    <w:semiHidden/>
     <w:unhideWhenUsed/>
   </w:style>
   <w:style w:type="table" w:default="1" w:styleId="TableNormal">

</xml_diff>

<commit_message>
Moved additional comment to be rendered using the check-list_template_high.yaml, as a normal checklist item; Added page number to the docx file.
</commit_message>
<xml_diff>
--- a/res/new_template_high.docx
+++ b/res/new_template_high.docx
@@ -1451,107 +1451,123 @@
     <w:p>
       <w:pPr>
         <w:rPr>
-          <w:b/>
-          <w:bCs/>
-        </w:rPr>
-      </w:pPr>
-    </w:p>
-    <w:tbl>
-      <w:tblPr>
-        <w:tblStyle w:val="TableGrid"/>
-        <w:tblW w:w="0" w:type="auto"/>
-        <w:tblLook w:val="04A0" w:firstRow="1" w:lastRow="0" w:firstColumn="1" w:lastColumn="0" w:noHBand="0" w:noVBand="1"/>
-      </w:tblPr>
-      <w:tblGrid>
-        <w:gridCol w:w="22361"/>
-      </w:tblGrid>
-      <w:tr>
-        <w:tc>
-          <w:tcPr>
-            <w:tcW w:w="22361" w:type="dxa"/>
-            <w:shd w:val="clear" w:color="auto" w:fill="153D63" w:themeFill="text2" w:themeFillTint="E6"/>
-          </w:tcPr>
-          <w:p>
-            <w:pPr>
-              <w:rPr>
-                <w:lang w:val="en-US"/>
-              </w:rPr>
-            </w:pPr>
-            <w:r>
-              <w:rPr>
-                <w:lang w:val="en-US"/>
-              </w:rPr>
-              <w:t>Other Curator’s Comment</w:t>
-            </w:r>
-          </w:p>
-        </w:tc>
-      </w:tr>
-      <w:tr>
-        <w:tc>
-          <w:tcPr>
-            <w:tcW w:w="22361" w:type="dxa"/>
-            <w:shd w:val="clear" w:color="auto" w:fill="auto"/>
-          </w:tcPr>
-          <w:p>
-            <w:pPr>
-              <w:rPr>
-                <w:lang w:val="en-US"/>
-              </w:rPr>
-            </w:pPr>
-          </w:p>
-          <w:p>
-            <w:pPr>
-              <w:rPr>
-                <w:lang w:val="en-US"/>
-              </w:rPr>
-            </w:pPr>
-          </w:p>
-          <w:p>
-            <w:pPr>
-              <w:rPr>
-                <w:lang w:val="en-US"/>
-              </w:rPr>
-            </w:pPr>
-          </w:p>
-          <w:p>
-            <w:pPr>
-              <w:rPr>
-                <w:lang w:val="en-US"/>
-              </w:rPr>
-            </w:pPr>
-          </w:p>
-          <w:p>
-            <w:pPr>
-              <w:rPr>
-                <w:lang w:val="en-US"/>
-              </w:rPr>
-            </w:pPr>
-          </w:p>
-          <w:p>
-            <w:pPr>
-              <w:rPr>
-                <w:lang w:val="en-US"/>
-              </w:rPr>
-            </w:pPr>
-          </w:p>
-        </w:tc>
-      </w:tr>
-    </w:tbl>
-    <w:p>
-      <w:pPr>
-        <w:rPr>
           <w:lang w:val="en-US"/>
         </w:rPr>
       </w:pPr>
     </w:p>
     <w:sectPr>
+      <w:footerReference w:type="default" r:id="rId7"/>
       <w:pgSz w:w="23811" w:h="16838" w:orient="landscape" w:code="8"/>
-      <w:pgMar w:top="720" w:right="720" w:bottom="720" w:left="720" w:header="720" w:footer="720" w:gutter="0"/>
+      <w:pgMar w:top="720" w:right="720" w:bottom="720" w:left="720" w:header="144" w:footer="432" w:gutter="0"/>
       <w:cols w:space="720"/>
       <w:docGrid w:linePitch="360"/>
     </w:sectPr>
   </w:body>
 </w:document>
+</file>
+
+<file path=word/endnotes.xml><?xml version="1.0" encoding="utf-8"?>
+<w:endnotes xmlns:wpc="http://schemas.microsoft.com/office/word/2010/wordprocessingCanvas" xmlns:cx="http://schemas.microsoft.com/office/drawing/2014/chartex" xmlns:cx1="http://schemas.microsoft.com/office/drawing/2015/9/8/chartex" xmlns:cx2="http://schemas.microsoft.com/office/drawing/2015/10/21/chartex" xmlns:cx3="http://schemas.microsoft.com/office/drawing/2016/5/9/chartex" xmlns:cx4="http://schemas.microsoft.com/office/drawing/2016/5/10/chartex" xmlns:cx5="http://schemas.microsoft.com/office/drawing/2016/5/11/chartex" xmlns:cx6="http://schemas.microsoft.com/office/drawing/2016/5/12/chartex" xmlns:cx7="http://schemas.microsoft.com/office/drawing/2016/5/13/chartex" xmlns:cx8="http://schemas.microsoft.com/office/drawing/2016/5/14/chartex" xmlns:mc="http://schemas.openxmlformats.org/markup-compatibility/2006" xmlns:aink="http://schemas.microsoft.com/office/drawing/2016/ink" xmlns:am3d="http://schemas.microsoft.com/office/drawing/2017/model3d" xmlns:o="urn:schemas-microsoft-com:office:office" xmlns:oel="http://schemas.microsoft.com/office/2019/extlst" xmlns:r="http://schemas.openxmlformats.org/officeDocument/2006/relationships" xmlns:m="http://schemas.openxmlformats.org/officeDocument/2006/math" xmlns:v="urn:schemas-microsoft-com:vml" xmlns:wp14="http://schemas.microsoft.com/office/word/2010/wordprocessingDrawing" xmlns:wp="http://schemas.openxmlformats.org/drawingml/2006/wordprocessingDrawing" xmlns:w10="urn:schemas-microsoft-com:office:word" xmlns:w="http://schemas.openxmlformats.org/wordprocessingml/2006/main" xmlns:w14="http://schemas.microsoft.com/office/word/2010/wordml" xmlns:w15="http://schemas.microsoft.com/office/word/2012/wordml" xmlns:w16cex="http://schemas.microsoft.com/office/word/2018/wordml/cex" xmlns:w16cid="http://schemas.microsoft.com/office/word/2016/wordml/cid" xmlns:w16="http://schemas.microsoft.com/office/word/2018/wordml" xmlns:w16du="http://schemas.microsoft.com/office/word/2023/wordml/word16du" xmlns:w16sdtdh="http://schemas.microsoft.com/office/word/2020/wordml/sdtdatahash" xmlns:w16sdtfl="http://schemas.microsoft.com/office/word/2024/wordml/sdtformatlock" xmlns:w16se="http://schemas.microsoft.com/office/word/2015/wordml/symex" xmlns:wpg="http://schemas.microsoft.com/office/word/2010/wordprocessingGroup" xmlns:wpi="http://schemas.microsoft.com/office/word/2010/wordprocessingInk" xmlns:wne="http://schemas.microsoft.com/office/word/2006/wordml" xmlns:wps="http://schemas.microsoft.com/office/word/2010/wordprocessingShape" mc:Ignorable="w14 w15 w16se w16cid w16 w16cex w16sdtdh w16sdtfl w16du wp14">
+  <w:endnote w:type="separator" w:id="-1">
+    <w:p>
+      <w:pPr>
+        <w:spacing w:after="0" w:line="240" w:lineRule="auto"/>
+      </w:pPr>
+      <w:r>
+        <w:separator/>
+      </w:r>
+    </w:p>
+  </w:endnote>
+  <w:endnote w:type="continuationSeparator" w:id="0">
+    <w:p>
+      <w:pPr>
+        <w:spacing w:after="0" w:line="240" w:lineRule="auto"/>
+      </w:pPr>
+      <w:r>
+        <w:continuationSeparator/>
+      </w:r>
+    </w:p>
+  </w:endnote>
+</w:endnotes>
+</file>
+
+<file path=word/footer1.xml><?xml version="1.0" encoding="utf-8"?>
+<w:ftr xmlns:wpc="http://schemas.microsoft.com/office/word/2010/wordprocessingCanvas" xmlns:cx="http://schemas.microsoft.com/office/drawing/2014/chartex" xmlns:cx1="http://schemas.microsoft.com/office/drawing/2015/9/8/chartex" xmlns:cx2="http://schemas.microsoft.com/office/drawing/2015/10/21/chartex" xmlns:cx3="http://schemas.microsoft.com/office/drawing/2016/5/9/chartex" xmlns:cx4="http://schemas.microsoft.com/office/drawing/2016/5/10/chartex" xmlns:cx5="http://schemas.microsoft.com/office/drawing/2016/5/11/chartex" xmlns:cx6="http://schemas.microsoft.com/office/drawing/2016/5/12/chartex" xmlns:cx7="http://schemas.microsoft.com/office/drawing/2016/5/13/chartex" xmlns:cx8="http://schemas.microsoft.com/office/drawing/2016/5/14/chartex" xmlns:mc="http://schemas.openxmlformats.org/markup-compatibility/2006" xmlns:aink="http://schemas.microsoft.com/office/drawing/2016/ink" xmlns:am3d="http://schemas.microsoft.com/office/drawing/2017/model3d" xmlns:o="urn:schemas-microsoft-com:office:office" xmlns:oel="http://schemas.microsoft.com/office/2019/extlst" xmlns:r="http://schemas.openxmlformats.org/officeDocument/2006/relationships" xmlns:m="http://schemas.openxmlformats.org/officeDocument/2006/math" xmlns:v="urn:schemas-microsoft-com:vml" xmlns:wp14="http://schemas.microsoft.com/office/word/2010/wordprocessingDrawing" xmlns:wp="http://schemas.openxmlformats.org/drawingml/2006/wordprocessingDrawing" xmlns:w10="urn:schemas-microsoft-com:office:word" xmlns:w="http://schemas.openxmlformats.org/wordprocessingml/2006/main" xmlns:w14="http://schemas.microsoft.com/office/word/2010/wordml" xmlns:w15="http://schemas.microsoft.com/office/word/2012/wordml" xmlns:w16cex="http://schemas.microsoft.com/office/word/2018/wordml/cex" xmlns:w16cid="http://schemas.microsoft.com/office/word/2016/wordml/cid" xmlns:w16="http://schemas.microsoft.com/office/word/2018/wordml" xmlns:w16du="http://schemas.microsoft.com/office/word/2023/wordml/word16du" xmlns:w16sdtdh="http://schemas.microsoft.com/office/word/2020/wordml/sdtdatahash" xmlns:w16sdtfl="http://schemas.microsoft.com/office/word/2024/wordml/sdtformatlock" xmlns:w16se="http://schemas.microsoft.com/office/word/2015/wordml/symex" xmlns:wpg="http://schemas.microsoft.com/office/word/2010/wordprocessingGroup" xmlns:wpi="http://schemas.microsoft.com/office/word/2010/wordprocessingInk" xmlns:wne="http://schemas.microsoft.com/office/word/2006/wordml" xmlns:wps="http://schemas.microsoft.com/office/word/2010/wordprocessingShape" mc:Ignorable="w14 w15 w16se w16cid w16 w16cex w16sdtdh w16sdtfl w16du wp14">
+  <w:sdt>
+    <w:sdtPr>
+      <w:id w:val="-375936416"/>
+      <w:docPartObj>
+        <w:docPartGallery w:val="Page Numbers (Bottom of Page)"/>
+        <w:docPartUnique/>
+      </w:docPartObj>
+    </w:sdtPr>
+    <w:sdtEndPr>
+      <w:rPr>
+        <w:noProof/>
+      </w:rPr>
+    </w:sdtEndPr>
+    <w:sdtContent>
+      <w:p>
+        <w:pPr>
+          <w:pStyle w:val="Footer"/>
+          <w:jc w:val="center"/>
+        </w:pPr>
+        <w:r>
+          <w:fldChar w:fldCharType="begin"/>
+        </w:r>
+        <w:r>
+          <w:instrText xml:space="preserve"> PAGE   \* MERGEFORMAT </w:instrText>
+        </w:r>
+        <w:r>
+          <w:fldChar w:fldCharType="separate"/>
+        </w:r>
+        <w:r>
+          <w:rPr>
+            <w:noProof/>
+          </w:rPr>
+          <w:t>2</w:t>
+        </w:r>
+        <w:r>
+          <w:rPr>
+            <w:noProof/>
+          </w:rPr>
+          <w:fldChar w:fldCharType="end"/>
+        </w:r>
+      </w:p>
+    </w:sdtContent>
+  </w:sdt>
+  <w:p>
+    <w:pPr>
+      <w:pStyle w:val="Footer"/>
+      <w:jc w:val="center"/>
+    </w:pPr>
+  </w:p>
+</w:ftr>
+</file>
+
+<file path=word/footnotes.xml><?xml version="1.0" encoding="utf-8"?>
+<w:footnotes xmlns:wpc="http://schemas.microsoft.com/office/word/2010/wordprocessingCanvas" xmlns:cx="http://schemas.microsoft.com/office/drawing/2014/chartex" xmlns:cx1="http://schemas.microsoft.com/office/drawing/2015/9/8/chartex" xmlns:cx2="http://schemas.microsoft.com/office/drawing/2015/10/21/chartex" xmlns:cx3="http://schemas.microsoft.com/office/drawing/2016/5/9/chartex" xmlns:cx4="http://schemas.microsoft.com/office/drawing/2016/5/10/chartex" xmlns:cx5="http://schemas.microsoft.com/office/drawing/2016/5/11/chartex" xmlns:cx6="http://schemas.microsoft.com/office/drawing/2016/5/12/chartex" xmlns:cx7="http://schemas.microsoft.com/office/drawing/2016/5/13/chartex" xmlns:cx8="http://schemas.microsoft.com/office/drawing/2016/5/14/chartex" xmlns:mc="http://schemas.openxmlformats.org/markup-compatibility/2006" xmlns:aink="http://schemas.microsoft.com/office/drawing/2016/ink" xmlns:am3d="http://schemas.microsoft.com/office/drawing/2017/model3d" xmlns:o="urn:schemas-microsoft-com:office:office" xmlns:oel="http://schemas.microsoft.com/office/2019/extlst" xmlns:r="http://schemas.openxmlformats.org/officeDocument/2006/relationships" xmlns:m="http://schemas.openxmlformats.org/officeDocument/2006/math" xmlns:v="urn:schemas-microsoft-com:vml" xmlns:wp14="http://schemas.microsoft.com/office/word/2010/wordprocessingDrawing" xmlns:wp="http://schemas.openxmlformats.org/drawingml/2006/wordprocessingDrawing" xmlns:w10="urn:schemas-microsoft-com:office:word" xmlns:w="http://schemas.openxmlformats.org/wordprocessingml/2006/main" xmlns:w14="http://schemas.microsoft.com/office/word/2010/wordml" xmlns:w15="http://schemas.microsoft.com/office/word/2012/wordml" xmlns:w16cex="http://schemas.microsoft.com/office/word/2018/wordml/cex" xmlns:w16cid="http://schemas.microsoft.com/office/word/2016/wordml/cid" xmlns:w16="http://schemas.microsoft.com/office/word/2018/wordml" xmlns:w16du="http://schemas.microsoft.com/office/word/2023/wordml/word16du" xmlns:w16sdtdh="http://schemas.microsoft.com/office/word/2020/wordml/sdtdatahash" xmlns:w16sdtfl="http://schemas.microsoft.com/office/word/2024/wordml/sdtformatlock" xmlns:w16se="http://schemas.microsoft.com/office/word/2015/wordml/symex" xmlns:wpg="http://schemas.microsoft.com/office/word/2010/wordprocessingGroup" xmlns:wpi="http://schemas.microsoft.com/office/word/2010/wordprocessingInk" xmlns:wne="http://schemas.microsoft.com/office/word/2006/wordml" xmlns:wps="http://schemas.microsoft.com/office/word/2010/wordprocessingShape" mc:Ignorable="w14 w15 w16se w16cid w16 w16cex w16sdtdh w16sdtfl w16du wp14">
+  <w:footnote w:type="separator" w:id="-1">
+    <w:p>
+      <w:pPr>
+        <w:spacing w:after="0" w:line="240" w:lineRule="auto"/>
+      </w:pPr>
+      <w:r>
+        <w:separator/>
+      </w:r>
+    </w:p>
+  </w:footnote>
+  <w:footnote w:type="continuationSeparator" w:id="0">
+    <w:p>
+      <w:pPr>
+        <w:spacing w:after="0" w:line="240" w:lineRule="auto"/>
+      </w:pPr>
+      <w:r>
+        <w:continuationSeparator/>
+      </w:r>
+    </w:p>
+  </w:footnote>
+</w:footnotes>
 </file>
 
 <file path=word/numbering.xml><?xml version="1.0" encoding="utf-8"?>
@@ -8569,6 +8585,56 @@
       <w:u w:val="single"/>
     </w:rPr>
   </w:style>
+  <w:style w:type="paragraph" w:styleId="Header">
+    <w:name w:val="header"/>
+    <w:basedOn w:val="Normal"/>
+    <w:link w:val="HeaderChar"/>
+    <w:uiPriority w:val="99"/>
+    <w:unhideWhenUsed/>
+    <w:rsid w:val="00266AC1"/>
+    <w:pPr>
+      <w:tabs>
+        <w:tab w:val="center" w:pos="4680"/>
+        <w:tab w:val="right" w:pos="9360"/>
+      </w:tabs>
+      <w:spacing w:after="0" w:line="240" w:lineRule="auto"/>
+    </w:pPr>
+  </w:style>
+  <w:style w:type="character" w:customStyle="1" w:styleId="HeaderChar">
+    <w:name w:val="Header Char"/>
+    <w:basedOn w:val="DefaultParagraphFont"/>
+    <w:link w:val="Header"/>
+    <w:uiPriority w:val="99"/>
+    <w:rsid w:val="00266AC1"/>
+    <w:rPr>
+      <w:lang w:val="en-CA"/>
+    </w:rPr>
+  </w:style>
+  <w:style w:type="paragraph" w:styleId="Footer">
+    <w:name w:val="footer"/>
+    <w:basedOn w:val="Normal"/>
+    <w:link w:val="FooterChar"/>
+    <w:uiPriority w:val="99"/>
+    <w:unhideWhenUsed/>
+    <w:rsid w:val="00266AC1"/>
+    <w:pPr>
+      <w:tabs>
+        <w:tab w:val="center" w:pos="4680"/>
+        <w:tab w:val="right" w:pos="9360"/>
+      </w:tabs>
+      <w:spacing w:after="0" w:line="240" w:lineRule="auto"/>
+    </w:pPr>
+  </w:style>
+  <w:style w:type="character" w:customStyle="1" w:styleId="FooterChar">
+    <w:name w:val="Footer Char"/>
+    <w:basedOn w:val="DefaultParagraphFont"/>
+    <w:link w:val="Footer"/>
+    <w:uiPriority w:val="99"/>
+    <w:rsid w:val="00266AC1"/>
+    <w:rPr>
+      <w:lang w:val="en-CA"/>
+    </w:rPr>
+  </w:style>
 </w:styles>
 </file>
 

</xml_diff>